<commit_message>
feat: enhance bookmark insertion logic to support formatting properties and improve range-path handling in document processing
</commit_message>
<xml_diff>
--- a/examples/word/bookmark.docx
+++ b/examples/word/bookmark.docx
@@ -7,7 +7,7 @@
         <w:t/>
       </w:r>
     </w:p>
-    <w:p paraId="3d668bdc">
+    <w:p paraId="37203bb7">
       <w:pPr>
         <w:pStyle val="Heading1"/>
       </w:pPr>
@@ -17,49 +17,49 @@
       <w:bookmarkStart id="1" name="renamed1"/>
       <w:bookmarkEnd id="1"/>
     </w:p>
-    <w:p paraId="8bf6e4be">
+    <w:p paraId="a0818539">
       <w:r>
         <w:t>First paragraph for bookmark testing.</w:t>
       </w:r>
-      <w:bookmarkStart name="withText" id="2"/>
+      <w:bookmarkStart id="2" name="withText"/>
       <w:r>
         <w:t>Bookmarked content</w:t>
       </w:r>
       <w:bookmarkEnd id="2"/>
     </w:p>
-    <w:p paraId="b4a10542">
+    <w:p paraId="95f60322">
       <w:r>
         <w:t>Second paragraph with some text content.</w:t>
       </w:r>
-      <w:bookmarkStart name="customId" id="99"/>
+      <w:bookmarkStart id="99" name="customId"/>
       <w:bookmarkEnd id="99"/>
     </w:p>
-    <w:p paraId="b587c8f4">
-      <w:bookmarkStart id="100" name="wrap1"/>
+    <w:p paraId="533ee470">
+      <w:bookmarkStart name="wrap1" id="100"/>
       <w:r>
         <w:t>Third paragraph for cross-para bookmark.</w:t>
       </w:r>
       <w:bookmarkEnd id="100"/>
     </w:p>
-    <w:p paraId="23bd468a">
-      <w:bookmarkStart id="101" name="range1"/>
+    <w:p paraId="0312d841">
+      <w:r>
+        <w:t>Paragraph for wrap testing.</w:t>
+      </w:r>
+    </w:p>
+    <w:p paraId="b737479e">
       <w:r>
         <w:t>Parag</w:t>
       </w:r>
+      <w:bookmarkStart id="101" name="range1"/>
       <w:r>
         <w:rPr>
           <w:color val="FF0000"/>
         </w:rPr>
-        <w:t xml:space="preserve">raph for wrap t</w:t>
-      </w:r>
-      <w:r>
-        <w:t xml:space="preserve">esting.</w:t>
+        <w:t xml:space="preserve">raph for range-</w:t>
       </w:r>
       <w:bookmarkEnd id="101"/>
-    </w:p>
-    <w:p paraId="f2572dac">
       <w:r>
-        <w:t>Paragraph for range-paths bookmark testing with enough characters.</w:t>
+        <w:t xml:space="preserve">paths bookmark testing with enough characters.</w:t>
       </w:r>
     </w:p>
   </w:body>

</xml_diff>

<commit_message>
chore: update version to 0.1.1 in Cargo.toml and enhance Makefile with new install-local and install-check targets; improve batch command handling in officecli with support for additional properties and scenarios
</commit_message>
<xml_diff>
--- a/examples/word/bookmark.docx
+++ b/examples/word/bookmark.docx
@@ -7,17 +7,17 @@
         <w:t/>
       </w:r>
     </w:p>
-    <w:p paraId="37203bb7">
+    <w:p paraId="0c4ee5a8">
       <w:pPr>
         <w:pStyle val="Heading1"/>
       </w:pPr>
       <w:r>
         <w:t>Bookmark Test Document</w:t>
       </w:r>
-      <w:bookmarkStart id="1" name="renamed1"/>
+      <w:bookmarkStart name="renamed1" id="1"/>
       <w:bookmarkEnd id="1"/>
     </w:p>
-    <w:p paraId="a0818539">
+    <w:p paraId="a167b7a5">
       <w:r>
         <w:t>First paragraph for bookmark testing.</w:t>
       </w:r>
@@ -27,39 +27,99 @@
       </w:r>
       <w:bookmarkEnd id="2"/>
     </w:p>
-    <w:p paraId="95f60322">
+    <w:p paraId="6b896f1d">
       <w:r>
         <w:t>Second paragraph with some text content.</w:t>
       </w:r>
-      <w:bookmarkStart id="99" name="customId"/>
+      <w:bookmarkStart name="customId" id="99"/>
       <w:bookmarkEnd id="99"/>
     </w:p>
-    <w:p paraId="533ee470">
+    <w:p paraId="62b3a56e">
       <w:bookmarkStart name="wrap1" id="100"/>
       <w:r>
         <w:t>Third paragraph for cross-para bookmark.</w:t>
       </w:r>
       <w:bookmarkEnd id="100"/>
     </w:p>
-    <w:p paraId="0312d841">
+    <w:p paraId="234410a9">
       <w:r>
         <w:t>Paragraph for wrap testing.</w:t>
       </w:r>
     </w:p>
-    <w:p paraId="b737479e">
+    <w:p paraId="6b66cf34">
       <w:r>
         <w:t>Parag</w:t>
       </w:r>
       <w:bookmarkStart id="101" name="range1"/>
       <w:r>
         <w:rPr>
-          <w:color val="FF0000"/>
+          <w:shd val="clear" color="auto" fill="CCFFCC"/>
+          <w:color val="0000FF"/>
         </w:rPr>
-        <w:t xml:space="preserve">raph for range-</w:t>
+        <w:t>raph for range-</w:t>
       </w:r>
       <w:bookmarkEnd id="101"/>
       <w:r>
-        <w:t xml:space="preserve">paths bookmark testing with enough characters.</w:t>
+        <w:t>paths bookmark testing with enough characters.</w:t>
+      </w:r>
+    </w:p>
+    <w:p paraId="c2155213">
+      <w:r>
+        <w:t>Another pa</w:t>
+      </w:r>
+      <w:bookmarkStart name="range2" id="102"/>
+      <w:r>
+        <w:rPr>
+          <w:shd fill="FFFF00" val="clear" color="auto"/>
+          <w:color val="FF0000"/>
+        </w:rPr>
+        <w:t>ragraph demonstratin</w:t>
+      </w:r>
+      <w:bookmarkEnd id="102"/>
+      <w:r>
+        <w:t>g range bookmark with both font color and background shading applied.</w:t>
+      </w:r>
+    </w:p>
+    <w:p paraId="8766e2e5">
+      <w:r>
+        <w:rPr>
+          <w:color val="0000FF"/>
+          <w:shd val="clear" fill="CCFFCC" color="auto"/>
+        </w:rPr>
+        <w:t>Batch test paragraph one.</w:t>
+      </w:r>
+    </w:p>
+    <w:p paraId="bd95623b">
+      <w:r>
+        <w:rPr>
+          <w:color val="9900CC"/>
+          <w:shd color="auto" val="clear" fill="FFCC99"/>
+        </w:rPr>
+        <w:t>Batch test paragraph two.</w:t>
+      </w:r>
+    </w:p>
+    <w:p paraId="9ad1d20d">
+      <w:bookmarkStart id="103" name="batchBk1"/>
+      <w:r>
+        <w:t>Batch test paragraph three.</w:t>
+      </w:r>
+      <w:bookmarkEnd id="103"/>
+    </w:p>
+    <w:p paraId="a10a69ba">
+      <w:r>
+        <w:t>Batch </w:t>
+      </w:r>
+      <w:bookmarkStart name="batchRange1" id="104"/>
+      <w:r>
+        <w:rPr>
+          <w:color val="FF0000"/>
+          <w:shd val="clear" color="auto" fill="FFFF00"/>
+        </w:rPr>
+        <w:t>range-paths bookmar</w:t>
+      </w:r>
+      <w:bookmarkEnd id="104"/>
+      <w:r>
+        <w:t>k paragraph with enough text content for testing.</w:t>
       </w:r>
     </w:p>
   </w:body>

</xml_diff>

<commit_message>
fix: update offset calculations to use Unicode character counts instead of byte lengths in text mapping and PDF extraction
</commit_message>
<xml_diff>
--- a/examples/word/bookmark.docx
+++ b/examples/word/bookmark.docx
@@ -7,54 +7,54 @@
         <w:t/>
       </w:r>
     </w:p>
-    <w:p paraId="0c4ee5a8">
+    <w:p paraId="efbc3fc2">
       <w:pPr>
         <w:pStyle val="Heading1"/>
       </w:pPr>
       <w:r>
         <w:t>Bookmark Test Document</w:t>
       </w:r>
-      <w:bookmarkStart name="renamed1" id="1"/>
+      <w:bookmarkStart id="1" name="renamed1"/>
       <w:bookmarkEnd id="1"/>
     </w:p>
-    <w:p paraId="a167b7a5">
+    <w:p paraId="b52d3ab9">
       <w:r>
         <w:t>First paragraph for bookmark testing.</w:t>
       </w:r>
-      <w:bookmarkStart id="2" name="withText"/>
+      <w:bookmarkStart name="withText" id="2"/>
       <w:r>
         <w:t>Bookmarked content</w:t>
       </w:r>
       <w:bookmarkEnd id="2"/>
     </w:p>
-    <w:p paraId="6b896f1d">
+    <w:p paraId="3be79e5e">
       <w:r>
         <w:t>Second paragraph with some text content.</w:t>
       </w:r>
-      <w:bookmarkStart name="customId" id="99"/>
+      <w:bookmarkStart id="99" name="customId"/>
       <w:bookmarkEnd id="99"/>
     </w:p>
-    <w:p paraId="62b3a56e">
+    <w:p paraId="53ffa02c">
       <w:bookmarkStart name="wrap1" id="100"/>
       <w:r>
         <w:t>Third paragraph for cross-para bookmark.</w:t>
       </w:r>
       <w:bookmarkEnd id="100"/>
     </w:p>
-    <w:p paraId="234410a9">
+    <w:p paraId="8bb20630">
       <w:r>
         <w:t>Paragraph for wrap testing.</w:t>
       </w:r>
     </w:p>
-    <w:p paraId="6b66cf34">
+    <w:p paraId="8b8609ea">
       <w:r>
         <w:t>Parag</w:t>
       </w:r>
-      <w:bookmarkStart id="101" name="range1"/>
+      <w:bookmarkStart name="range1" id="101"/>
       <w:r>
         <w:rPr>
-          <w:shd val="clear" color="auto" fill="CCFFCC"/>
           <w:color val="0000FF"/>
+          <w:shd fill="CCFFCC" color="auto" val="clear"/>
         </w:rPr>
         <w:t>raph for range-</w:t>
       </w:r>
@@ -63,15 +63,15 @@
         <w:t>paths bookmark testing with enough characters.</w:t>
       </w:r>
     </w:p>
-    <w:p paraId="c2155213">
+    <w:p paraId="1467dab5">
       <w:r>
         <w:t>Another pa</w:t>
       </w:r>
       <w:bookmarkStart name="range2" id="102"/>
       <w:r>
         <w:rPr>
-          <w:shd fill="FFFF00" val="clear" color="auto"/>
           <w:color val="FF0000"/>
+          <w:shd val="clear" fill="FFFF00" color="auto"/>
         </w:rPr>
         <w:t>ragraph demonstratin</w:t>
       </w:r>
@@ -80,40 +80,40 @@
         <w:t>g range bookmark with both font color and background shading applied.</w:t>
       </w:r>
     </w:p>
-    <w:p paraId="8766e2e5">
+    <w:p paraId="826bcbdb">
       <w:r>
         <w:rPr>
+          <w:shd fill="CCFFCC" color="auto" val="clear"/>
           <w:color val="0000FF"/>
-          <w:shd val="clear" fill="CCFFCC" color="auto"/>
         </w:rPr>
         <w:t>Batch test paragraph one.</w:t>
       </w:r>
     </w:p>
-    <w:p paraId="bd95623b">
+    <w:p paraId="c5be0b29">
       <w:r>
         <w:rPr>
           <w:color val="9900CC"/>
-          <w:shd color="auto" val="clear" fill="FFCC99"/>
+          <w:shd fill="FFCC99" val="clear" color="auto"/>
         </w:rPr>
         <w:t>Batch test paragraph two.</w:t>
       </w:r>
     </w:p>
-    <w:p paraId="9ad1d20d">
+    <w:p paraId="fc62bb1e">
       <w:bookmarkStart id="103" name="batchBk1"/>
       <w:r>
         <w:t>Batch test paragraph three.</w:t>
       </w:r>
       <w:bookmarkEnd id="103"/>
     </w:p>
-    <w:p paraId="a10a69ba">
+    <w:p paraId="2be1d1c5">
       <w:r>
         <w:t>Batch </w:t>
       </w:r>
-      <w:bookmarkStart name="batchRange1" id="104"/>
+      <w:bookmarkStart id="104" name="batchRange1"/>
       <w:r>
         <w:rPr>
           <w:color val="FF0000"/>
-          <w:shd val="clear" color="auto" fill="FFFF00"/>
+          <w:shd fill="FFFF00" val="clear" color="auto"/>
         </w:rPr>
         <w:t>range-paths bookmar</w:t>
       </w:r>

</xml_diff>